<commit_message>
sistemati piccoli errori implementazione e documentazione
</commit_message>
<xml_diff>
--- a/docs/documentazione-progetto.docx
+++ b/docs/documentazione-progetto.docx
@@ -278,7 +278,7 @@
               </mc:Choice>
               <mc:Fallback>
                 <w:pict>
-                  <v:line w14:anchorId="348B3574" id="Connettore diritto 42" o:spid="_x0000_s1026" style="position:absolute;z-index:251655680;visibility:visible;mso-wrap-style:square;mso-width-percent:0;mso-wrap-distance-left:9pt;mso-wrap-distance-top:0;mso-wrap-distance-right:9pt;mso-wrap-distance-bottom:0;mso-position-horizontal:absolute;mso-position-horizontal-relative:text;mso-position-vertical:absolute;mso-position-vertical-relative:text;mso-width-percent:0;mso-width-relative:margin" from=".15pt,.6pt" to="425.55pt,.6pt" o:gfxdata="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" strokecolor="#4472c4 [3204]" strokeweight="1.75pt">
+                  <v:line w14:anchorId="46E5EE1C" id="Connettore diritto 42" o:spid="_x0000_s1026" style="position:absolute;z-index:251655680;visibility:visible;mso-wrap-style:square;mso-width-percent:0;mso-wrap-distance-left:9pt;mso-wrap-distance-top:0;mso-wrap-distance-right:9pt;mso-wrap-distance-bottom:0;mso-position-horizontal:absolute;mso-position-horizontal-relative:text;mso-position-vertical:absolute;mso-position-vertical-relative:text;mso-width-percent:0;mso-width-relative:margin" from=".15pt,.6pt" to="425.55pt,.6pt" o:gfxdata="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" strokecolor="#4472c4 [3204]" strokeweight="1.75pt">
                     <v:stroke joinstyle="miter"/>
                   </v:line>
                 </w:pict>
@@ -359,11 +359,11 @@
             <w:tblLook w:val="01E0" w:firstRow="1" w:lastRow="1" w:firstColumn="1" w:lastColumn="1" w:noHBand="0" w:noVBand="0"/>
           </w:tblPr>
           <w:tblGrid>
-            <w:gridCol w:w="2962"/>
-            <w:gridCol w:w="1860"/>
-            <w:gridCol w:w="999"/>
-            <w:gridCol w:w="2966"/>
-            <w:gridCol w:w="70"/>
+            <w:gridCol w:w="2512"/>
+            <w:gridCol w:w="1593"/>
+            <w:gridCol w:w="807"/>
+            <w:gridCol w:w="3892"/>
+            <w:gridCol w:w="53"/>
           </w:tblGrid>
           <w:tr>
             <w:trPr>
@@ -393,18 +393,8 @@
                     <w:b/>
                     <w:szCs w:val="22"/>
                   </w:rPr>
-                  <w:t xml:space="preserve">Membri </w:t>
+                  <w:t>Membri del team</w:t>
                 </w:r>
-                <w:proofErr w:type="gramStart"/>
-                <w:r>
-                  <w:rPr>
-                    <w:rFonts w:cstheme="minorHAnsi"/>
-                    <w:b/>
-                    <w:szCs w:val="22"/>
-                  </w:rPr>
-                  <w:t>del team</w:t>
-                </w:r>
-                <w:proofErr w:type="gramEnd"/>
               </w:p>
             </w:tc>
           </w:tr>
@@ -535,11 +525,20 @@
                   <w:adjustRightInd w:val="0"/>
                   <w:rPr>
                     <w:rFonts w:cstheme="minorHAnsi"/>
-                    <w:b/>
+                    <w:bCs/>
                     <w:color w:val="333399"/>
                     <w:szCs w:val="22"/>
                   </w:rPr>
                 </w:pPr>
+                <w:r>
+                  <w:rPr>
+                    <w:rFonts w:cstheme="minorHAnsi"/>
+                    <w:bCs/>
+                    <w:color w:val="333399"/>
+                    <w:szCs w:val="22"/>
+                  </w:rPr>
+                  <w:t>Pittella Carmine</w:t>
+                </w:r>
               </w:p>
             </w:tc>
             <w:tc>
@@ -558,6 +557,14 @@
                     <w:szCs w:val="22"/>
                   </w:rPr>
                 </w:pPr>
+                <w:r>
+                  <w:rPr>
+                    <w:rFonts w:cstheme="minorHAnsi"/>
+                    <w:color w:val="333399"/>
+                    <w:szCs w:val="22"/>
+                  </w:rPr>
+                  <w:t>265786</w:t>
+                </w:r>
               </w:p>
             </w:tc>
             <w:tc>
@@ -575,6 +582,14 @@
                     <w:szCs w:val="22"/>
                   </w:rPr>
                 </w:pPr>
+                <w:r>
+                  <w:rPr>
+                    <w:rFonts w:cstheme="minorHAnsi"/>
+                    <w:color w:val="333399"/>
+                    <w:szCs w:val="22"/>
+                  </w:rPr>
+                  <w:t>carmine.pittella@student.univaq.it</w:t>
+                </w:r>
               </w:p>
             </w:tc>
           </w:tr>
@@ -599,6 +614,14 @@
                     <w:szCs w:val="22"/>
                   </w:rPr>
                 </w:pPr>
+                <w:r>
+                  <w:rPr>
+                    <w:rFonts w:cstheme="minorHAnsi"/>
+                    <w:color w:val="333399"/>
+                    <w:szCs w:val="22"/>
+                  </w:rPr>
+                  <w:t>De Bernardinis Matteo</w:t>
+                </w:r>
               </w:p>
             </w:tc>
             <w:tc>
@@ -617,6 +640,14 @@
                     <w:szCs w:val="22"/>
                   </w:rPr>
                 </w:pPr>
+                <w:r>
+                  <w:rPr>
+                    <w:rFonts w:cstheme="minorHAnsi"/>
+                    <w:color w:val="333399"/>
+                    <w:szCs w:val="22"/>
+                  </w:rPr>
+                  <w:t>267585</w:t>
+                </w:r>
               </w:p>
             </w:tc>
             <w:tc>
@@ -634,6 +665,14 @@
                     <w:szCs w:val="22"/>
                   </w:rPr>
                 </w:pPr>
+                <w:r>
+                  <w:rPr>
+                    <w:rFonts w:cstheme="minorHAnsi"/>
+                    <w:color w:val="333399"/>
+                    <w:szCs w:val="22"/>
+                  </w:rPr>
+                  <w:t>matteo.debernardinis@student.univaq.it</w:t>
+                </w:r>
               </w:p>
             </w:tc>
           </w:tr>
@@ -658,6 +697,14 @@
                     <w:szCs w:val="22"/>
                   </w:rPr>
                 </w:pPr>
+                <w:r>
+                  <w:rPr>
+                    <w:rFonts w:cstheme="minorHAnsi"/>
+                    <w:color w:val="333399"/>
+                    <w:szCs w:val="22"/>
+                  </w:rPr>
+                  <w:t>Salvatore Matteo</w:t>
+                </w:r>
               </w:p>
             </w:tc>
             <w:tc>
@@ -676,6 +723,22 @@
                     <w:szCs w:val="22"/>
                   </w:rPr>
                 </w:pPr>
+                <w:r>
+                  <w:rPr>
+                    <w:rFonts w:cstheme="minorHAnsi"/>
+                    <w:color w:val="333399"/>
+                    <w:szCs w:val="22"/>
+                  </w:rPr>
+                  <w:t>26578</w:t>
+                </w:r>
+                <w:r>
+                  <w:rPr>
+                    <w:rFonts w:cstheme="minorHAnsi"/>
+                    <w:color w:val="333399"/>
+                    <w:szCs w:val="22"/>
+                  </w:rPr>
+                  <w:t>0</w:t>
+                </w:r>
               </w:p>
             </w:tc>
             <w:tc>
@@ -693,6 +756,14 @@
                     <w:szCs w:val="22"/>
                   </w:rPr>
                 </w:pPr>
+                <w:r>
+                  <w:rPr>
+                    <w:rFonts w:cstheme="minorHAnsi"/>
+                    <w:color w:val="333399"/>
+                    <w:szCs w:val="22"/>
+                  </w:rPr>
+                  <w:t>matteo.salvatore@student.univaq.it</w:t>
+                </w:r>
               </w:p>
             </w:tc>
           </w:tr>
@@ -889,7 +960,7 @@
               </mc:Choice>
               <mc:Fallback>
                 <w:pict>
-                  <v:line w14:anchorId="4911E391" id="Connettore diritto 43" o:spid="_x0000_s1026" style="position:absolute;z-index:251695616;visibility:visible;mso-wrap-style:square;mso-width-percent:0;mso-wrap-distance-left:9pt;mso-wrap-distance-top:0;mso-wrap-distance-right:9pt;mso-wrap-distance-bottom:0;mso-position-horizontal:absolute;mso-position-horizontal-relative:text;mso-position-vertical:absolute;mso-position-vertical-relative:text;mso-width-percent:0;mso-width-relative:margin" from=".15pt,6.05pt" to="425.55pt,6.05pt" o:gfxdata="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" strokecolor="#4472c4 [3204]" strokeweight="1.5pt">
+                  <v:line w14:anchorId="1D015FD7" id="Connettore diritto 43" o:spid="_x0000_s1026" style="position:absolute;z-index:251695616;visibility:visible;mso-wrap-style:square;mso-width-percent:0;mso-wrap-distance-left:9pt;mso-wrap-distance-top:0;mso-wrap-distance-right:9pt;mso-wrap-distance-bottom:0;mso-position-horizontal:absolute;mso-position-horizontal-relative:text;mso-position-vertical:absolute;mso-position-vertical-relative:text;mso-width-percent:0;mso-width-relative:margin" from=".15pt,6.05pt" to="425.55pt,6.05pt" o:gfxdata="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" strokecolor="#4472c4 [3204]" strokeweight="1.5pt">
                     <v:stroke joinstyle="miter"/>
                   </v:line>
                 </w:pict>
@@ -1374,6 +1445,7 @@
         <w:rPr>
           <w:rFonts w:cstheme="majorHAnsi"/>
         </w:rPr>
+        <w:lastRenderedPageBreak/>
         <w:t>Capitolo 1 – Caso di studio</w:t>
       </w:r>
       <w:bookmarkEnd w:id="1"/>
@@ -1410,71 +1482,130 @@
     <w:p>
       <w:pPr>
         <w:pStyle w:val="Nessunaspaziatura"/>
+        <w:jc w:val="both"/>
       </w:pPr>
     </w:p>
     <w:p>
       <w:pPr>
-        <w:rPr>
-          <w:rFonts w:cstheme="minorHAnsi"/>
+        <w:pStyle w:val="Nessunaspaziatura"/>
+        <w:jc w:val="both"/>
+      </w:pPr>
+    </w:p>
+    <w:p>
+      <w:pPr>
+        <w:rPr>
+          <w:rFonts w:asciiTheme="majorHAnsi" w:hAnsiTheme="majorHAnsi" w:cstheme="majorHAnsi"/>
+          <w:sz w:val="24"/>
+          <w:szCs w:val="24"/>
         </w:rPr>
       </w:pPr>
       <w:r>
         <w:rPr>
-          <w:rFonts w:cstheme="minorHAnsi"/>
-        </w:rPr>
-        <w:t>RIMUOVERE DESCRIZIONE</w:t>
+          <w:rFonts w:asciiTheme="majorHAnsi" w:hAnsiTheme="majorHAnsi" w:cstheme="majorHAnsi"/>
+          <w:sz w:val="24"/>
+          <w:szCs w:val="24"/>
+        </w:rPr>
+        <w:t xml:space="preserve">AutonoleggioMCM è un’applicazione che permette di gestire l’intera procedura </w:t>
       </w:r>
       <w:r>
         <w:rPr>
-          <w:rFonts w:cstheme="minorHAnsi"/>
-        </w:rPr>
-        <w:t xml:space="preserve"> TESTO SOTTOSTANTE</w:t>
+          <w:rFonts w:asciiTheme="majorHAnsi" w:hAnsiTheme="majorHAnsi" w:cstheme="majorHAnsi"/>
+          <w:sz w:val="24"/>
+          <w:szCs w:val="24"/>
+        </w:rPr>
+        <w:t>per il noleggio d</w:t>
+      </w:r>
+      <w:r>
+        <w:rPr>
+          <w:rFonts w:asciiTheme="majorHAnsi" w:hAnsiTheme="majorHAnsi" w:cstheme="majorHAnsi"/>
+          <w:sz w:val="24"/>
+          <w:szCs w:val="24"/>
+        </w:rPr>
+        <w:t xml:space="preserve">ell’auto adatta! È infatti possibile filtrare i veicoli da noleggiare in base a molte caratteristiche. </w:t>
       </w:r>
     </w:p>
     <w:p>
+      <w:pPr>
+        <w:rPr>
+          <w:rFonts w:asciiTheme="majorHAnsi" w:hAnsiTheme="majorHAnsi" w:cstheme="majorHAnsi"/>
+          <w:sz w:val="24"/>
+          <w:szCs w:val="24"/>
+        </w:rPr>
+      </w:pPr>
       <w:r>
-        <w:t>Prendendo spunto dall’idea fornita dal docente, dare una descrizione più dettagliata del caso di studio.</w:t>
+        <w:rPr>
+          <w:rFonts w:asciiTheme="majorHAnsi" w:hAnsiTheme="majorHAnsi" w:cstheme="majorHAnsi"/>
+          <w:sz w:val="24"/>
+          <w:szCs w:val="24"/>
+        </w:rPr>
+        <w:t>Accessibile ed intuitiva, consente di orientarsi attraverso tutte le sue funzionalità grazie ai dettagli forniti, e ai relativi messaggi di errore che compaiono, garantendo di svolgere le procedure nella maniera corretta.</w:t>
       </w:r>
     </w:p>
     <w:p>
       <w:pPr>
-        <w:pStyle w:val="Nessunaspaziatura"/>
-      </w:pPr>
+        <w:rPr>
+          <w:rFonts w:asciiTheme="majorHAnsi" w:hAnsiTheme="majorHAnsi" w:cstheme="majorHAnsi"/>
+          <w:sz w:val="24"/>
+          <w:szCs w:val="24"/>
+        </w:rPr>
+      </w:pPr>
+      <w:r>
+        <w:rPr>
+          <w:rFonts w:asciiTheme="majorHAnsi" w:hAnsiTheme="majorHAnsi" w:cstheme="majorHAnsi"/>
+          <w:sz w:val="24"/>
+          <w:szCs w:val="24"/>
+        </w:rPr>
+        <w:t>I colori dell’interfaccia grafica tendono al rosso perché l’abbiamo ritenuto il più adatto ad una piattaforma di questa tipologia.</w:t>
+      </w:r>
     </w:p>
     <w:p>
       <w:pPr>
         <w:rPr>
           <w:rFonts w:asciiTheme="majorHAnsi" w:hAnsiTheme="majorHAnsi" w:cstheme="majorHAnsi"/>
-        </w:rPr>
-      </w:pPr>
-    </w:p>
-    <w:p>
-      <w:pPr>
-        <w:rPr>
-          <w:rFonts w:asciiTheme="majorHAnsi" w:hAnsiTheme="majorHAnsi" w:cstheme="majorHAnsi"/>
-        </w:rPr>
-      </w:pPr>
-    </w:p>
-    <w:p>
-      <w:pPr>
-        <w:rPr>
-          <w:rFonts w:asciiTheme="majorHAnsi" w:hAnsiTheme="majorHAnsi" w:cstheme="majorHAnsi"/>
-        </w:rPr>
-      </w:pPr>
-    </w:p>
-    <w:p>
-      <w:pPr>
-        <w:rPr>
-          <w:rFonts w:asciiTheme="majorHAnsi" w:hAnsiTheme="majorHAnsi" w:cstheme="majorHAnsi"/>
-        </w:rPr>
-      </w:pPr>
-    </w:p>
-    <w:p>
-      <w:pPr>
-        <w:rPr>
-          <w:rFonts w:asciiTheme="majorHAnsi" w:hAnsiTheme="majorHAnsi" w:cstheme="majorHAnsi"/>
-        </w:rPr>
-      </w:pPr>
+          <w:sz w:val="24"/>
+          <w:szCs w:val="24"/>
+        </w:rPr>
+      </w:pPr>
+      <w:r>
+        <w:rPr>
+          <w:rFonts w:asciiTheme="majorHAnsi" w:hAnsiTheme="majorHAnsi" w:cstheme="majorHAnsi"/>
+          <w:sz w:val="24"/>
+          <w:szCs w:val="24"/>
+        </w:rPr>
+        <w:t>Il programma è stato scritto utilizzando il linguaggio Java (versione 11</w:t>
+      </w:r>
+      <w:r>
+        <w:rPr>
+          <w:rFonts w:asciiTheme="majorHAnsi" w:hAnsiTheme="majorHAnsi" w:cstheme="majorHAnsi"/>
+          <w:sz w:val="24"/>
+          <w:szCs w:val="24"/>
+        </w:rPr>
+        <w:t>.0.2</w:t>
+      </w:r>
+      <w:r>
+        <w:rPr>
+          <w:rFonts w:asciiTheme="majorHAnsi" w:hAnsiTheme="majorHAnsi" w:cstheme="majorHAnsi"/>
+          <w:sz w:val="24"/>
+          <w:szCs w:val="24"/>
+        </w:rPr>
+        <w:t xml:space="preserve">), mentre la parte grafica è stata realizzata con Java FX </w:t>
+      </w:r>
+      <w:r>
+        <w:rPr>
+          <w:rFonts w:asciiTheme="majorHAnsi" w:hAnsiTheme="majorHAnsi" w:cstheme="majorHAnsi"/>
+          <w:sz w:val="24"/>
+          <w:szCs w:val="24"/>
+        </w:rPr>
+        <w:t>14</w:t>
+      </w:r>
+      <w:r>
+        <w:rPr>
+          <w:rFonts w:asciiTheme="majorHAnsi" w:hAnsiTheme="majorHAnsi" w:cstheme="majorHAnsi"/>
+          <w:sz w:val="24"/>
+          <w:szCs w:val="24"/>
+        </w:rPr>
+        <w:t>. La gestione dei dati, sia delle aziende che dei professionisti, avviene sia su file che su RAM.</w:t>
+      </w:r>
     </w:p>
     <w:p>
       <w:pPr>
@@ -1528,6 +1659,7 @@
         <w:rPr>
           <w:rFonts w:cstheme="majorHAnsi"/>
         </w:rPr>
+        <w:lastRenderedPageBreak/>
         <w:t>1.</w:t>
       </w:r>
       <w:r>
@@ -1572,69 +1704,533 @@
     <w:p>
       <w:pPr>
         <w:rPr>
-          <w:rFonts w:cstheme="minorHAnsi"/>
+          <w:rFonts w:asciiTheme="majorHAnsi" w:hAnsiTheme="majorHAnsi" w:cstheme="majorHAnsi"/>
+          <w:sz w:val="24"/>
+          <w:szCs w:val="22"/>
         </w:rPr>
       </w:pPr>
       <w:r>
         <w:rPr>
-          <w:rFonts w:cstheme="minorHAnsi"/>
-        </w:rPr>
-        <w:t>RIMUOVERE DESCRIZIONE</w:t>
-      </w:r>
-      <w:r>
-        <w:rPr>
-          <w:rFonts w:cstheme="minorHAnsi"/>
-        </w:rPr>
-        <w:t xml:space="preserve"> TESTO SOTTOSTANTE</w:t>
+          <w:rFonts w:asciiTheme="majorHAnsi" w:hAnsiTheme="majorHAnsi" w:cstheme="majorHAnsi"/>
+          <w:sz w:val="24"/>
+          <w:szCs w:val="22"/>
+        </w:rPr>
+        <w:t>La nostra applicazione è indirizzata a 3 tipi di utenti:</w:t>
       </w:r>
     </w:p>
     <w:p>
       <w:pPr>
-        <w:rPr>
-          <w:rFonts w:cstheme="minorHAnsi"/>
+        <w:pStyle w:val="Paragrafoelenco"/>
+        <w:numPr>
+          <w:ilvl w:val="0"/>
+          <w:numId w:val="39"/>
+        </w:numPr>
+        <w:rPr>
+          <w:rFonts w:asciiTheme="majorHAnsi" w:hAnsiTheme="majorHAnsi" w:cstheme="majorHAnsi"/>
+          <w:sz w:val="24"/>
+          <w:szCs w:val="22"/>
         </w:rPr>
       </w:pPr>
       <w:r>
         <w:rPr>
-          <w:rFonts w:cstheme="minorHAnsi"/>
-        </w:rPr>
-        <w:t xml:space="preserve">Fornire una lista </w:t>
+          <w:rFonts w:asciiTheme="majorHAnsi" w:hAnsiTheme="majorHAnsi" w:cstheme="majorHAnsi"/>
+          <w:sz w:val="24"/>
+          <w:szCs w:val="22"/>
+        </w:rPr>
+        <w:t>Amministratore:</w:t>
+      </w:r>
+    </w:p>
+    <w:p>
+      <w:pPr>
+        <w:pStyle w:val="Paragrafoelenco"/>
+        <w:rPr>
+          <w:rFonts w:asciiTheme="majorHAnsi" w:hAnsiTheme="majorHAnsi" w:cstheme="majorHAnsi"/>
+          <w:sz w:val="24"/>
+          <w:szCs w:val="22"/>
+        </w:rPr>
+      </w:pPr>
+      <w:r>
+        <w:rPr>
+          <w:rFonts w:asciiTheme="majorHAnsi" w:hAnsiTheme="majorHAnsi" w:cstheme="majorHAnsi"/>
+          <w:sz w:val="24"/>
+          <w:szCs w:val="22"/>
+        </w:rPr>
+        <w:t>Inserire, modificare e cancellare sia clienti che operatori, i quali vengono visualizzati in una tabella.</w:t>
+      </w:r>
+    </w:p>
+    <w:p>
+      <w:pPr>
+        <w:pStyle w:val="Paragrafoelenco"/>
+        <w:rPr>
+          <w:rFonts w:asciiTheme="majorHAnsi" w:hAnsiTheme="majorHAnsi" w:cstheme="majorHAnsi"/>
+          <w:sz w:val="24"/>
+          <w:szCs w:val="22"/>
+        </w:rPr>
+      </w:pPr>
+      <w:r>
+        <w:rPr>
+          <w:rFonts w:asciiTheme="majorHAnsi" w:hAnsiTheme="majorHAnsi" w:cstheme="majorHAnsi"/>
+          <w:sz w:val="24"/>
+          <w:szCs w:val="22"/>
+        </w:rPr>
+        <w:t>inserire, modificare, cancellare tipologie di veicoli da noleggiare</w:t>
       </w:r>
       <w:r>
         <w:rPr>
-          <w:rFonts w:cstheme="minorHAnsi"/>
-        </w:rPr>
-        <w:t xml:space="preserve">completa ed esaustiva </w:t>
+          <w:rFonts w:asciiTheme="majorHAnsi" w:hAnsiTheme="majorHAnsi" w:cstheme="majorHAnsi"/>
+          <w:sz w:val="24"/>
+          <w:szCs w:val="22"/>
+        </w:rPr>
+        <w:t>, a patto che non vi siano veicoli appartenenti a quella tipologia.</w:t>
+      </w:r>
+    </w:p>
+    <w:p>
+      <w:pPr>
+        <w:pStyle w:val="Paragrafoelenco"/>
+        <w:rPr>
+          <w:rFonts w:asciiTheme="majorHAnsi" w:hAnsiTheme="majorHAnsi" w:cstheme="majorHAnsi"/>
+          <w:sz w:val="24"/>
+          <w:szCs w:val="22"/>
+        </w:rPr>
+      </w:pPr>
+      <w:r>
+        <w:rPr>
+          <w:rFonts w:asciiTheme="majorHAnsi" w:hAnsiTheme="majorHAnsi" w:cstheme="majorHAnsi"/>
+          <w:sz w:val="24"/>
+          <w:szCs w:val="22"/>
+        </w:rPr>
+        <w:t xml:space="preserve">inserire, modificare, cancellare </w:t>
       </w:r>
       <w:r>
         <w:rPr>
-          <w:rFonts w:cstheme="minorHAnsi"/>
-        </w:rPr>
-        <w:t xml:space="preserve">dei requisiti </w:t>
+          <w:rFonts w:asciiTheme="majorHAnsi" w:hAnsiTheme="majorHAnsi" w:cstheme="majorHAnsi"/>
+          <w:sz w:val="24"/>
+          <w:szCs w:val="22"/>
+        </w:rPr>
+        <w:t xml:space="preserve">veicoli da noleggiare, inserendo tutti i dati necessari, tra questi anche le due tipologie di tariffe del veicolo. Si possono cancellare solo veicolo che non sono né in noleggio né non disponibili. </w:t>
+      </w:r>
+    </w:p>
+    <w:p>
+      <w:pPr>
+        <w:pStyle w:val="Paragrafoelenco"/>
+        <w:rPr>
+          <w:rFonts w:asciiTheme="majorHAnsi" w:hAnsiTheme="majorHAnsi" w:cstheme="majorHAnsi"/>
+          <w:sz w:val="24"/>
+          <w:szCs w:val="22"/>
+        </w:rPr>
+      </w:pPr>
+      <w:r>
+        <w:rPr>
+          <w:rFonts w:asciiTheme="majorHAnsi" w:hAnsiTheme="majorHAnsi" w:cstheme="majorHAnsi"/>
+          <w:sz w:val="24"/>
+          <w:szCs w:val="22"/>
+        </w:rPr>
+        <w:t>Tutti i veicoli sono visibili in una tabella con le informazioni principali, ma è possibile aprire la scheda dettagliata del veicolo e volendo, modificarne i valori.</w:t>
+      </w:r>
+    </w:p>
+    <w:p>
+      <w:pPr>
+        <w:pStyle w:val="Paragrafoelenco"/>
+        <w:rPr>
+          <w:rFonts w:asciiTheme="majorHAnsi" w:hAnsiTheme="majorHAnsi" w:cstheme="majorHAnsi"/>
+          <w:sz w:val="24"/>
+          <w:szCs w:val="22"/>
+        </w:rPr>
+      </w:pPr>
+      <w:r>
+        <w:rPr>
+          <w:rFonts w:asciiTheme="majorHAnsi" w:hAnsiTheme="majorHAnsi" w:cstheme="majorHAnsi"/>
+          <w:sz w:val="24"/>
+          <w:szCs w:val="22"/>
+        </w:rPr>
+        <w:t>Ogni veicolo ha una serie di feedback lasciati dagli utenti dopo un noleggio, l’amministratore può visualizzarli tutti.</w:t>
+      </w:r>
+    </w:p>
+    <w:p>
+      <w:pPr>
+        <w:pStyle w:val="Paragrafoelenco"/>
+        <w:rPr>
+          <w:rFonts w:asciiTheme="majorHAnsi" w:hAnsiTheme="majorHAnsi" w:cstheme="majorHAnsi"/>
+          <w:sz w:val="24"/>
+          <w:szCs w:val="22"/>
+        </w:rPr>
+      </w:pPr>
+      <w:r>
+        <w:rPr>
+          <w:rFonts w:asciiTheme="majorHAnsi" w:hAnsiTheme="majorHAnsi" w:cstheme="majorHAnsi"/>
+          <w:sz w:val="24"/>
+          <w:szCs w:val="22"/>
+        </w:rPr>
+        <w:t xml:space="preserve">Visualizzare i noleggi in corso e quelli che hanno richiesto </w:t>
       </w:r>
       <w:r>
         <w:rPr>
-          <w:rFonts w:cstheme="minorHAnsi"/>
-        </w:rPr>
-        <w:t xml:space="preserve">funzionali </w:t>
+          <w:rFonts w:asciiTheme="majorHAnsi" w:hAnsiTheme="majorHAnsi" w:cstheme="majorHAnsi"/>
+          <w:sz w:val="24"/>
+          <w:szCs w:val="22"/>
+        </w:rPr>
+        <w:t>l’intervento di assistenza (e il relativo dettaglio).</w:t>
+      </w:r>
+    </w:p>
+    <w:p>
+      <w:pPr>
+        <w:pStyle w:val="Paragrafoelenco"/>
+        <w:rPr>
+          <w:rFonts w:asciiTheme="majorHAnsi" w:hAnsiTheme="majorHAnsi" w:cstheme="majorHAnsi"/>
+          <w:sz w:val="24"/>
+          <w:szCs w:val="22"/>
+        </w:rPr>
+      </w:pPr>
+    </w:p>
+    <w:p>
+      <w:pPr>
+        <w:pStyle w:val="Paragrafoelenco"/>
+        <w:numPr>
+          <w:ilvl w:val="0"/>
+          <w:numId w:val="39"/>
+        </w:numPr>
+        <w:rPr>
+          <w:rFonts w:asciiTheme="majorHAnsi" w:hAnsiTheme="majorHAnsi" w:cstheme="majorHAnsi"/>
+          <w:sz w:val="24"/>
+          <w:szCs w:val="22"/>
+        </w:rPr>
+      </w:pPr>
+      <w:r>
+        <w:rPr>
+          <w:rFonts w:asciiTheme="majorHAnsi" w:hAnsiTheme="majorHAnsi" w:cstheme="majorHAnsi"/>
+          <w:sz w:val="24"/>
+          <w:szCs w:val="22"/>
+        </w:rPr>
+        <w:t>Operatore</w:t>
+      </w:r>
+    </w:p>
+    <w:p>
+      <w:pPr>
+        <w:pStyle w:val="Paragrafoelenco"/>
+        <w:rPr>
+          <w:rFonts w:asciiTheme="majorHAnsi" w:hAnsiTheme="majorHAnsi" w:cstheme="majorHAnsi"/>
+          <w:sz w:val="24"/>
+          <w:szCs w:val="22"/>
+        </w:rPr>
+      </w:pPr>
+      <w:r>
+        <w:rPr>
+          <w:rFonts w:asciiTheme="majorHAnsi" w:hAnsiTheme="majorHAnsi" w:cstheme="majorHAnsi"/>
+          <w:sz w:val="24"/>
+          <w:szCs w:val="22"/>
+        </w:rPr>
+        <w:t>Anche l’operatore può visualizzare tutti i veicoli presenti nel sistema, ma a differenza dell’amministratore non può modificarne i valori, può comunque vederne i feedback rilasciati dagli utenti.</w:t>
+      </w:r>
+    </w:p>
+    <w:p>
+      <w:pPr>
+        <w:pStyle w:val="Paragrafoelenco"/>
+        <w:rPr>
+          <w:rFonts w:asciiTheme="majorHAnsi" w:hAnsiTheme="majorHAnsi" w:cstheme="majorHAnsi"/>
+          <w:sz w:val="24"/>
+          <w:szCs w:val="22"/>
+        </w:rPr>
+      </w:pPr>
+      <w:r>
+        <w:rPr>
+          <w:rFonts w:asciiTheme="majorHAnsi" w:hAnsiTheme="majorHAnsi" w:cstheme="majorHAnsi"/>
+          <w:sz w:val="24"/>
+          <w:szCs w:val="22"/>
+        </w:rPr>
+        <w:t>Visualizzare le prenotazioni di noleggio effettuate dai clienti e inviare a quest’ultimi una notifica indicando dettagli generici e l’ora in cui ritirare il veicolo noleggiato.</w:t>
+      </w:r>
+    </w:p>
+    <w:p>
+      <w:pPr>
+        <w:pStyle w:val="Paragrafoelenco"/>
+        <w:rPr>
+          <w:rFonts w:asciiTheme="majorHAnsi" w:hAnsiTheme="majorHAnsi" w:cstheme="majorHAnsi"/>
+          <w:sz w:val="24"/>
+          <w:szCs w:val="22"/>
+        </w:rPr>
+      </w:pPr>
+      <w:r>
+        <w:rPr>
+          <w:rFonts w:asciiTheme="majorHAnsi" w:hAnsiTheme="majorHAnsi" w:cstheme="majorHAnsi"/>
+          <w:sz w:val="24"/>
+          <w:szCs w:val="22"/>
+        </w:rPr>
+        <w:t>Gestire le richieste di assistenza richieste durante un noleggio, stabilendo se è necessario sostituire il veicolo oppure notificare la data e ora di gestione dell’assistenza.</w:t>
+      </w:r>
+    </w:p>
+    <w:p>
+      <w:pPr>
+        <w:pStyle w:val="Paragrafoelenco"/>
+        <w:rPr>
+          <w:rFonts w:asciiTheme="majorHAnsi" w:hAnsiTheme="majorHAnsi" w:cstheme="majorHAnsi"/>
+          <w:sz w:val="24"/>
+          <w:szCs w:val="22"/>
+        </w:rPr>
+      </w:pPr>
+      <w:r>
+        <w:rPr>
+          <w:rFonts w:asciiTheme="majorHAnsi" w:hAnsiTheme="majorHAnsi" w:cstheme="majorHAnsi"/>
+          <w:sz w:val="24"/>
+          <w:szCs w:val="22"/>
+        </w:rPr>
+        <w:t>Visualizzare i noleggi in corso (come per l’amministratore), e i noleggi in riconsegna in una specifica data.</w:t>
+      </w:r>
+    </w:p>
+    <w:p>
+      <w:pPr>
+        <w:pStyle w:val="Paragrafoelenco"/>
+        <w:rPr>
+          <w:rFonts w:asciiTheme="majorHAnsi" w:hAnsiTheme="majorHAnsi" w:cstheme="majorHAnsi"/>
+          <w:sz w:val="24"/>
+          <w:szCs w:val="22"/>
+        </w:rPr>
+      </w:pPr>
+      <w:r>
+        <w:rPr>
+          <w:rFonts w:asciiTheme="majorHAnsi" w:hAnsiTheme="majorHAnsi" w:cstheme="majorHAnsi"/>
+          <w:sz w:val="24"/>
+          <w:szCs w:val="22"/>
+        </w:rPr>
+        <w:t>Gestire la riconsegna di un veicolo, se il noleggio prevedeva il pagamento della tariffa sul chilometraggio, allora sarà compito dell’amministratore stabilire quanti chilometri sono stati percorsi</w:t>
       </w:r>
       <w:r>
         <w:rPr>
-          <w:rFonts w:cstheme="minorHAnsi"/>
-        </w:rPr>
-        <w:t>della vostra app</w:t>
+          <w:rFonts w:asciiTheme="majorHAnsi" w:hAnsiTheme="majorHAnsi" w:cstheme="majorHAnsi"/>
+          <w:sz w:val="24"/>
+          <w:szCs w:val="22"/>
+        </w:rPr>
+        <w:t xml:space="preserve">, aggiornando nel sistema il chilometraggio del veicolo, </w:t>
       </w:r>
       <w:r>
         <w:rPr>
-          <w:rFonts w:cstheme="minorHAnsi"/>
-        </w:rPr>
-        <w:t>licazione organizzandoli per tipologie di persone che sono state identificate nel capitolo precedente</w:t>
+          <w:rFonts w:asciiTheme="majorHAnsi" w:hAnsiTheme="majorHAnsi" w:cstheme="majorHAnsi"/>
+          <w:sz w:val="24"/>
+          <w:szCs w:val="22"/>
+        </w:rPr>
+        <w:t>e calcolare il prezzo da pagare.</w:t>
+      </w:r>
+    </w:p>
+    <w:p>
+      <w:pPr>
+        <w:pStyle w:val="Paragrafoelenco"/>
+        <w:rPr>
+          <w:rFonts w:asciiTheme="majorHAnsi" w:hAnsiTheme="majorHAnsi" w:cstheme="majorHAnsi"/>
+          <w:sz w:val="24"/>
+          <w:szCs w:val="22"/>
+        </w:rPr>
+      </w:pPr>
+      <w:r>
+        <w:rPr>
+          <w:rFonts w:asciiTheme="majorHAnsi" w:hAnsiTheme="majorHAnsi" w:cstheme="majorHAnsi"/>
+          <w:sz w:val="24"/>
+          <w:szCs w:val="22"/>
+        </w:rPr>
+        <w:t xml:space="preserve">  </w:t>
+      </w:r>
+    </w:p>
+    <w:p>
+      <w:pPr>
+        <w:pStyle w:val="Paragrafoelenco"/>
+        <w:numPr>
+          <w:ilvl w:val="0"/>
+          <w:numId w:val="39"/>
+        </w:numPr>
+        <w:rPr>
+          <w:rFonts w:asciiTheme="majorHAnsi" w:hAnsiTheme="majorHAnsi" w:cstheme="majorHAnsi"/>
+          <w:sz w:val="24"/>
+          <w:szCs w:val="22"/>
+        </w:rPr>
+      </w:pPr>
+      <w:r>
+        <w:rPr>
+          <w:rFonts w:asciiTheme="majorHAnsi" w:hAnsiTheme="majorHAnsi" w:cstheme="majorHAnsi"/>
+          <w:sz w:val="24"/>
+          <w:szCs w:val="22"/>
+        </w:rPr>
+        <w:t>Cliente</w:t>
+      </w:r>
+    </w:p>
+    <w:p>
+      <w:pPr>
+        <w:pStyle w:val="Paragrafoelenco"/>
+        <w:rPr>
+          <w:rFonts w:asciiTheme="majorHAnsi" w:hAnsiTheme="majorHAnsi" w:cstheme="majorHAnsi"/>
+          <w:sz w:val="24"/>
+          <w:szCs w:val="22"/>
+        </w:rPr>
+      </w:pPr>
+      <w:r>
+        <w:rPr>
+          <w:rFonts w:asciiTheme="majorHAnsi" w:hAnsiTheme="majorHAnsi" w:cstheme="majorHAnsi"/>
+          <w:sz w:val="24"/>
+          <w:szCs w:val="22"/>
+        </w:rPr>
+        <w:t>Registrarsi al sistema inserendo alcuni dati anagrafici, (username, password..)</w:t>
+      </w:r>
+    </w:p>
+    <w:p>
+      <w:pPr>
+        <w:pStyle w:val="Paragrafoelenco"/>
+        <w:rPr>
+          <w:rFonts w:asciiTheme="majorHAnsi" w:hAnsiTheme="majorHAnsi" w:cstheme="majorHAnsi"/>
+          <w:sz w:val="24"/>
+          <w:szCs w:val="22"/>
+        </w:rPr>
+      </w:pPr>
+      <w:r>
+        <w:rPr>
+          <w:rFonts w:asciiTheme="majorHAnsi" w:hAnsiTheme="majorHAnsi" w:cstheme="majorHAnsi"/>
+          <w:sz w:val="24"/>
+          <w:szCs w:val="22"/>
+        </w:rPr>
+        <w:t>C</w:t>
       </w:r>
       <w:r>
         <w:rPr>
-          <w:rFonts w:cstheme="minorHAnsi"/>
+          <w:rFonts w:asciiTheme="majorHAnsi" w:hAnsiTheme="majorHAnsi" w:cstheme="majorHAnsi"/>
+          <w:sz w:val="24"/>
+          <w:szCs w:val="22"/>
+        </w:rPr>
+        <w:t>onsultare i veicoli disponibili per il noleggio</w:t>
+      </w:r>
+      <w:r>
+        <w:rPr>
+          <w:rFonts w:asciiTheme="majorHAnsi" w:hAnsiTheme="majorHAnsi" w:cstheme="majorHAnsi"/>
+          <w:sz w:val="24"/>
+          <w:szCs w:val="22"/>
+        </w:rPr>
+        <w:t xml:space="preserve"> in base a</w:t>
+      </w:r>
+      <w:r>
+        <w:rPr>
+          <w:rFonts w:asciiTheme="majorHAnsi" w:hAnsiTheme="majorHAnsi" w:cstheme="majorHAnsi"/>
+          <w:sz w:val="24"/>
+          <w:szCs w:val="22"/>
+        </w:rPr>
+        <w:t>lle caratteristiche principali dei veicoli (alimentazione, tipologia..).</w:t>
+      </w:r>
+    </w:p>
+    <w:p>
+      <w:pPr>
+        <w:pStyle w:val="Paragrafoelenco"/>
+        <w:rPr>
+          <w:rFonts w:asciiTheme="majorHAnsi" w:hAnsiTheme="majorHAnsi" w:cstheme="majorHAnsi"/>
+          <w:sz w:val="24"/>
+          <w:szCs w:val="22"/>
+        </w:rPr>
+      </w:pPr>
+      <w:r>
+        <w:rPr>
+          <w:rFonts w:asciiTheme="majorHAnsi" w:hAnsiTheme="majorHAnsi" w:cstheme="majorHAnsi"/>
+          <w:sz w:val="24"/>
+          <w:szCs w:val="22"/>
+        </w:rPr>
+        <w:t>V</w:t>
+      </w:r>
+      <w:r>
+        <w:rPr>
+          <w:rFonts w:asciiTheme="majorHAnsi" w:hAnsiTheme="majorHAnsi" w:cstheme="majorHAnsi"/>
+          <w:sz w:val="24"/>
+          <w:szCs w:val="22"/>
+        </w:rPr>
+        <w:t xml:space="preserve">isualizzare i feedback degli utenti che hanno noleggiato in precedenza un </w:t>
+      </w:r>
+      <w:r>
+        <w:rPr>
+          <w:rFonts w:asciiTheme="majorHAnsi" w:hAnsiTheme="majorHAnsi" w:cstheme="majorHAnsi"/>
+          <w:sz w:val="24"/>
+          <w:szCs w:val="22"/>
+        </w:rPr>
+        <w:t>ve</w:t>
+      </w:r>
+      <w:r>
+        <w:rPr>
+          <w:rFonts w:asciiTheme="majorHAnsi" w:hAnsiTheme="majorHAnsi" w:cstheme="majorHAnsi"/>
+          <w:sz w:val="24"/>
+          <w:szCs w:val="22"/>
+        </w:rPr>
+        <w:t>icolo</w:t>
+      </w:r>
+      <w:r>
+        <w:rPr>
+          <w:rFonts w:asciiTheme="majorHAnsi" w:hAnsiTheme="majorHAnsi" w:cstheme="majorHAnsi"/>
+          <w:sz w:val="24"/>
+          <w:szCs w:val="22"/>
         </w:rPr>
         <w:t>.</w:t>
+      </w:r>
+    </w:p>
+    <w:p>
+      <w:pPr>
+        <w:pStyle w:val="Paragrafoelenco"/>
+        <w:rPr>
+          <w:rFonts w:asciiTheme="majorHAnsi" w:hAnsiTheme="majorHAnsi" w:cstheme="majorHAnsi"/>
+          <w:sz w:val="24"/>
+          <w:szCs w:val="22"/>
+        </w:rPr>
+      </w:pPr>
+      <w:r>
+        <w:rPr>
+          <w:rFonts w:asciiTheme="majorHAnsi" w:hAnsiTheme="majorHAnsi" w:cstheme="majorHAnsi"/>
+          <w:sz w:val="24"/>
+          <w:szCs w:val="22"/>
+        </w:rPr>
+        <w:lastRenderedPageBreak/>
+        <w:t>Effettuare un preventivo per poi prenotare effettivamente un noleggio per un certo periodo.</w:t>
+      </w:r>
+    </w:p>
+    <w:p>
+      <w:pPr>
+        <w:pStyle w:val="Paragrafoelenco"/>
+        <w:rPr>
+          <w:rFonts w:asciiTheme="majorHAnsi" w:hAnsiTheme="majorHAnsi" w:cstheme="majorHAnsi"/>
+          <w:sz w:val="24"/>
+          <w:szCs w:val="22"/>
+        </w:rPr>
+      </w:pPr>
+      <w:r>
+        <w:rPr>
+          <w:rFonts w:asciiTheme="majorHAnsi" w:hAnsiTheme="majorHAnsi" w:cstheme="majorHAnsi"/>
+          <w:sz w:val="24"/>
+          <w:szCs w:val="22"/>
+        </w:rPr>
+        <w:t>Richiedere assistenza prima, durante, dopo il noleggio, la richiesta verrà poi presa in carico dall’operatore.</w:t>
+      </w:r>
+    </w:p>
+    <w:p>
+      <w:pPr>
+        <w:pStyle w:val="Paragrafoelenco"/>
+        <w:rPr>
+          <w:rFonts w:asciiTheme="majorHAnsi" w:hAnsiTheme="majorHAnsi" w:cstheme="majorHAnsi"/>
+          <w:sz w:val="24"/>
+          <w:szCs w:val="22"/>
+        </w:rPr>
+      </w:pPr>
+      <w:r>
+        <w:rPr>
+          <w:rFonts w:asciiTheme="majorHAnsi" w:hAnsiTheme="majorHAnsi" w:cstheme="majorHAnsi"/>
+          <w:sz w:val="24"/>
+          <w:szCs w:val="22"/>
+        </w:rPr>
+        <w:t>Tramite una schermata il cliente può visualizzare le notifiche relative all’assistenza, qualora fosse stata richiesta, e all’orario in cui può ritirare il veicolo noleggiato.</w:t>
+      </w:r>
+    </w:p>
+    <w:p>
+      <w:pPr>
+        <w:pStyle w:val="Paragrafoelenco"/>
+        <w:rPr>
+          <w:rFonts w:asciiTheme="majorHAnsi" w:hAnsiTheme="majorHAnsi" w:cstheme="majorHAnsi"/>
+          <w:sz w:val="24"/>
+          <w:szCs w:val="22"/>
+        </w:rPr>
+      </w:pPr>
+      <w:r>
+        <w:rPr>
+          <w:rFonts w:asciiTheme="majorHAnsi" w:hAnsiTheme="majorHAnsi" w:cstheme="majorHAnsi"/>
+          <w:sz w:val="24"/>
+          <w:szCs w:val="22"/>
+        </w:rPr>
+        <w:t>Al termine del noleggio il cliente può lasciare un feedback sul veicolo del noleggio, il quale si aggiungerà a quelli già esistenti.</w:t>
       </w:r>
     </w:p>
     <w:p>
@@ -1646,6 +2242,7 @@
       </w:r>
       <w:bookmarkStart w:id="4" w:name="_Toc38393260"/>
       <w:r>
+        <w:lastRenderedPageBreak/>
         <w:t xml:space="preserve">1.3 </w:t>
       </w:r>
       <w:r>
@@ -1668,120 +2265,66 @@
     </w:p>
     <w:p>
       <w:pPr>
+        <w:ind w:hanging="1276"/>
+      </w:pPr>
+      <w:r>
         <w:rPr>
           <w:rFonts w:cstheme="minorHAnsi"/>
-        </w:rPr>
-      </w:pPr>
-      <w:r>
-        <w:rPr>
-          <w:rFonts w:cstheme="minorHAnsi"/>
-        </w:rPr>
-        <w:t>RIMUOVERE DESCRIZIONE</w:t>
-      </w:r>
-      <w:r>
-        <w:rPr>
-          <w:rFonts w:cstheme="minorHAnsi"/>
-        </w:rPr>
-        <w:t xml:space="preserve"> TESTO SOTTOSTANTE</w:t>
+          <w:noProof/>
+        </w:rPr>
+        <w:drawing>
+          <wp:inline distT="0" distB="0" distL="0" distR="0" wp14:anchorId="43713F2F" wp14:editId="194FDAC7">
+            <wp:extent cx="7003415" cy="5619750"/>
+            <wp:effectExtent l="0" t="0" r="6985" b="0"/>
+            <wp:docPr id="1" name="Immagine 1"/>
+            <wp:cNvGraphicFramePr>
+              <a:graphicFrameLocks xmlns:a="http://schemas.openxmlformats.org/drawingml/2006/main" noChangeAspect="1"/>
+            </wp:cNvGraphicFramePr>
+            <a:graphic xmlns:a="http://schemas.openxmlformats.org/drawingml/2006/main">
+              <a:graphicData uri="http://schemas.openxmlformats.org/drawingml/2006/picture">
+                <pic:pic xmlns:pic="http://schemas.openxmlformats.org/drawingml/2006/picture">
+                  <pic:nvPicPr>
+                    <pic:cNvPr id="0" name="Picture 1"/>
+                    <pic:cNvPicPr>
+                      <a:picLocks noChangeAspect="1" noChangeArrowheads="1"/>
+                    </pic:cNvPicPr>
+                  </pic:nvPicPr>
+                  <pic:blipFill>
+                    <a:blip r:embed="rId9">
+                      <a:extLst>
+                        <a:ext uri="{28A0092B-C50C-407E-A947-70E740481C1C}">
+                          <a14:useLocalDpi xmlns:a14="http://schemas.microsoft.com/office/drawing/2010/main" val="0"/>
+                        </a:ext>
+                      </a:extLst>
+                    </a:blip>
+                    <a:srcRect/>
+                    <a:stretch>
+                      <a:fillRect/>
+                    </a:stretch>
+                  </pic:blipFill>
+                  <pic:spPr bwMode="auto">
+                    <a:xfrm>
+                      <a:off x="0" y="0"/>
+                      <a:ext cx="7019164" cy="5632387"/>
+                    </a:xfrm>
+                    <a:prstGeom prst="rect">
+                      <a:avLst/>
+                    </a:prstGeom>
+                    <a:noFill/>
+                    <a:ln>
+                      <a:noFill/>
+                    </a:ln>
+                  </pic:spPr>
+                </pic:pic>
+              </a:graphicData>
+            </a:graphic>
+          </wp:inline>
+        </w:drawing>
       </w:r>
     </w:p>
-    <w:p>
-      <w:pPr>
-        <w:rPr>
-          <w:rFonts w:cstheme="minorHAnsi"/>
-        </w:rPr>
-      </w:pPr>
-      <w:r>
-        <w:rPr>
-          <w:rFonts w:cstheme="minorHAnsi"/>
-        </w:rPr>
-        <w:t>Mostrare un c</w:t>
-      </w:r>
-      <w:r>
-        <w:rPr>
-          <w:rFonts w:cstheme="minorHAnsi"/>
-        </w:rPr>
-        <w:t xml:space="preserve">lass </w:t>
-      </w:r>
-      <w:proofErr w:type="spellStart"/>
-      <w:r>
-        <w:rPr>
-          <w:rFonts w:cstheme="minorHAnsi"/>
-        </w:rPr>
-        <w:t>diagram</w:t>
-      </w:r>
-      <w:proofErr w:type="spellEnd"/>
-      <w:r>
-        <w:rPr>
-          <w:rFonts w:cstheme="minorHAnsi"/>
-        </w:rPr>
-        <w:t xml:space="preserve"> che rappresenta il </w:t>
-      </w:r>
-      <w:r>
-        <w:rPr>
-          <w:rFonts w:cstheme="minorHAnsi"/>
-        </w:rPr>
-        <w:t>domain</w:t>
-      </w:r>
-      <w:r>
-        <w:rPr>
-          <w:rFonts w:cstheme="minorHAnsi"/>
-        </w:rPr>
-        <w:t xml:space="preserve"> model della ap</w:t>
-      </w:r>
-      <w:r>
-        <w:rPr>
-          <w:rFonts w:cstheme="minorHAnsi"/>
-        </w:rPr>
-        <w:t>plicazione</w:t>
-      </w:r>
-      <w:r>
-        <w:rPr>
-          <w:rFonts w:cstheme="minorHAnsi"/>
-        </w:rPr>
-        <w:t xml:space="preserve"> contenente entità e relazioni tra esse. Le entità e le relazioni derivano dalle funzionalità descritt</w:t>
-      </w:r>
-      <w:r>
-        <w:rPr>
-          <w:rFonts w:cstheme="minorHAnsi"/>
-        </w:rPr>
-        <w:t>e</w:t>
-      </w:r>
-      <w:r>
-        <w:rPr>
-          <w:rFonts w:cstheme="minorHAnsi"/>
-        </w:rPr>
-        <w:t xml:space="preserve"> nel</w:t>
-      </w:r>
-      <w:r>
-        <w:rPr>
-          <w:rFonts w:cstheme="minorHAnsi"/>
-        </w:rPr>
-        <w:t>la</w:t>
-      </w:r>
-      <w:r>
-        <w:rPr>
-          <w:rFonts w:cstheme="minorHAnsi"/>
-        </w:rPr>
-        <w:t xml:space="preserve"> </w:t>
-      </w:r>
-      <w:r>
-        <w:rPr>
-          <w:rFonts w:cstheme="minorHAnsi"/>
-        </w:rPr>
-        <w:t xml:space="preserve">sezione </w:t>
-      </w:r>
-      <w:r>
-        <w:rPr>
-          <w:rFonts w:cstheme="minorHAnsi"/>
-        </w:rPr>
-        <w:t>precedente.</w:t>
-      </w:r>
-    </w:p>
-    <w:p/>
     <w:sectPr>
-      <w:headerReference w:type="default" r:id="rId9"/>
-      <w:footerReference w:type="default" r:id="rId10"/>
+      <w:headerReference w:type="default" r:id="rId10"/>
+      <w:footerReference w:type="default" r:id="rId11"/>
       <w:pgSz w:w="11906" w:h="16838"/>
       <w:pgMar w:top="1418" w:right="1701" w:bottom="1418" w:left="1701" w:header="709" w:footer="709" w:gutter="0"/>
       <w:pgNumType w:start="0"/>
@@ -3506,6 +4049,119 @@
     </w:lvl>
   </w:abstractNum>
   <w:abstractNum w:abstractNumId="14" w15:restartNumberingAfterBreak="0">
+    <w:nsid w:val="637A7CF5"/>
+    <w:multiLevelType w:val="hybridMultilevel"/>
+    <w:tmpl w:val="53881DF0"/>
+    <w:lvl w:ilvl="0" w:tplc="04100001">
+      <w:start w:val="1"/>
+      <w:numFmt w:val="bullet"/>
+      <w:lvlText w:val=""/>
+      <w:lvlJc w:val="left"/>
+      <w:pPr>
+        <w:ind w:left="720" w:hanging="360"/>
+      </w:pPr>
+      <w:rPr>
+        <w:rFonts w:ascii="Symbol" w:hAnsi="Symbol" w:hint="default"/>
+      </w:rPr>
+    </w:lvl>
+    <w:lvl w:ilvl="1" w:tplc="04100003" w:tentative="1">
+      <w:start w:val="1"/>
+      <w:numFmt w:val="bullet"/>
+      <w:lvlText w:val="o"/>
+      <w:lvlJc w:val="left"/>
+      <w:pPr>
+        <w:ind w:left="1440" w:hanging="360"/>
+      </w:pPr>
+      <w:rPr>
+        <w:rFonts w:ascii="Courier New" w:hAnsi="Courier New" w:cs="Courier New" w:hint="default"/>
+      </w:rPr>
+    </w:lvl>
+    <w:lvl w:ilvl="2" w:tplc="04100005" w:tentative="1">
+      <w:start w:val="1"/>
+      <w:numFmt w:val="bullet"/>
+      <w:lvlText w:val=""/>
+      <w:lvlJc w:val="left"/>
+      <w:pPr>
+        <w:ind w:left="2160" w:hanging="360"/>
+      </w:pPr>
+      <w:rPr>
+        <w:rFonts w:ascii="Wingdings" w:hAnsi="Wingdings" w:hint="default"/>
+      </w:rPr>
+    </w:lvl>
+    <w:lvl w:ilvl="3" w:tplc="04100001" w:tentative="1">
+      <w:start w:val="1"/>
+      <w:numFmt w:val="bullet"/>
+      <w:lvlText w:val=""/>
+      <w:lvlJc w:val="left"/>
+      <w:pPr>
+        <w:ind w:left="2880" w:hanging="360"/>
+      </w:pPr>
+      <w:rPr>
+        <w:rFonts w:ascii="Symbol" w:hAnsi="Symbol" w:hint="default"/>
+      </w:rPr>
+    </w:lvl>
+    <w:lvl w:ilvl="4" w:tplc="04100003" w:tentative="1">
+      <w:start w:val="1"/>
+      <w:numFmt w:val="bullet"/>
+      <w:lvlText w:val="o"/>
+      <w:lvlJc w:val="left"/>
+      <w:pPr>
+        <w:ind w:left="3600" w:hanging="360"/>
+      </w:pPr>
+      <w:rPr>
+        <w:rFonts w:ascii="Courier New" w:hAnsi="Courier New" w:cs="Courier New" w:hint="default"/>
+      </w:rPr>
+    </w:lvl>
+    <w:lvl w:ilvl="5" w:tplc="04100005" w:tentative="1">
+      <w:start w:val="1"/>
+      <w:numFmt w:val="bullet"/>
+      <w:lvlText w:val=""/>
+      <w:lvlJc w:val="left"/>
+      <w:pPr>
+        <w:ind w:left="4320" w:hanging="360"/>
+      </w:pPr>
+      <w:rPr>
+        <w:rFonts w:ascii="Wingdings" w:hAnsi="Wingdings" w:hint="default"/>
+      </w:rPr>
+    </w:lvl>
+    <w:lvl w:ilvl="6" w:tplc="04100001" w:tentative="1">
+      <w:start w:val="1"/>
+      <w:numFmt w:val="bullet"/>
+      <w:lvlText w:val=""/>
+      <w:lvlJc w:val="left"/>
+      <w:pPr>
+        <w:ind w:left="5040" w:hanging="360"/>
+      </w:pPr>
+      <w:rPr>
+        <w:rFonts w:ascii="Symbol" w:hAnsi="Symbol" w:hint="default"/>
+      </w:rPr>
+    </w:lvl>
+    <w:lvl w:ilvl="7" w:tplc="04100003" w:tentative="1">
+      <w:start w:val="1"/>
+      <w:numFmt w:val="bullet"/>
+      <w:lvlText w:val="o"/>
+      <w:lvlJc w:val="left"/>
+      <w:pPr>
+        <w:ind w:left="5760" w:hanging="360"/>
+      </w:pPr>
+      <w:rPr>
+        <w:rFonts w:ascii="Courier New" w:hAnsi="Courier New" w:cs="Courier New" w:hint="default"/>
+      </w:rPr>
+    </w:lvl>
+    <w:lvl w:ilvl="8" w:tplc="04100005" w:tentative="1">
+      <w:start w:val="1"/>
+      <w:numFmt w:val="bullet"/>
+      <w:lvlText w:val=""/>
+      <w:lvlJc w:val="left"/>
+      <w:pPr>
+        <w:ind w:left="6480" w:hanging="360"/>
+      </w:pPr>
+      <w:rPr>
+        <w:rFonts w:ascii="Wingdings" w:hAnsi="Wingdings" w:hint="default"/>
+      </w:rPr>
+    </w:lvl>
+  </w:abstractNum>
+  <w:abstractNum w:abstractNumId="15" w15:restartNumberingAfterBreak="0">
     <w:nsid w:val="65500030"/>
     <w:multiLevelType w:val="hybridMultilevel"/>
     <w:tmpl w:val="C8BEABEA"/>
@@ -3591,7 +4247,7 @@
       </w:pPr>
     </w:lvl>
   </w:abstractNum>
-  <w:abstractNum w:abstractNumId="15" w15:restartNumberingAfterBreak="0">
+  <w:abstractNum w:abstractNumId="16" w15:restartNumberingAfterBreak="0">
     <w:nsid w:val="6A482762"/>
     <w:multiLevelType w:val="hybridMultilevel"/>
     <w:tmpl w:val="122A30B0"/>
@@ -3677,7 +4333,7 @@
       </w:pPr>
     </w:lvl>
   </w:abstractNum>
-  <w:abstractNum w:abstractNumId="16" w15:restartNumberingAfterBreak="0">
+  <w:abstractNum w:abstractNumId="17" w15:restartNumberingAfterBreak="0">
     <w:nsid w:val="701767C6"/>
     <w:multiLevelType w:val="hybridMultilevel"/>
     <w:tmpl w:val="CDFA8C2E"/>
@@ -3790,7 +4446,7 @@
       </w:rPr>
     </w:lvl>
   </w:abstractNum>
-  <w:abstractNum w:abstractNumId="17" w15:restartNumberingAfterBreak="0">
+  <w:abstractNum w:abstractNumId="18" w15:restartNumberingAfterBreak="0">
     <w:nsid w:val="738F0374"/>
     <w:multiLevelType w:val="multilevel"/>
     <w:tmpl w:val="6C66E342"/>
@@ -3939,7 +4595,7 @@
       </w:rPr>
     </w:lvl>
   </w:abstractNum>
-  <w:abstractNum w:abstractNumId="18" w15:restartNumberingAfterBreak="0">
+  <w:abstractNum w:abstractNumId="19" w15:restartNumberingAfterBreak="0">
     <w:nsid w:val="7726323F"/>
     <w:multiLevelType w:val="multilevel"/>
     <w:tmpl w:val="CEDAFB36"/>
@@ -4071,13 +4727,13 @@
     <w:abstractNumId w:val="7"/>
   </w:num>
   <w:num w:numId="7">
-    <w:abstractNumId w:val="18"/>
+    <w:abstractNumId w:val="19"/>
   </w:num>
   <w:num w:numId="8">
     <w:abstractNumId w:val="6"/>
   </w:num>
   <w:num w:numId="9">
-    <w:abstractNumId w:val="17"/>
+    <w:abstractNumId w:val="18"/>
   </w:num>
   <w:num w:numId="10">
     <w:abstractNumId w:val="10"/>
@@ -4086,7 +4742,7 @@
     <w:abstractNumId w:val="8"/>
   </w:num>
   <w:num w:numId="12">
-    <w:abstractNumId w:val="16"/>
+    <w:abstractNumId w:val="17"/>
   </w:num>
   <w:num w:numId="13">
     <w:abstractNumId w:val="5"/>
@@ -4098,7 +4754,7 @@
     <w:abstractNumId w:val="0"/>
   </w:num>
   <w:num w:numId="16">
-    <w:abstractNumId w:val="15"/>
+    <w:abstractNumId w:val="16"/>
   </w:num>
   <w:num w:numId="17">
     <w:abstractNumId w:val="2"/>
@@ -4161,10 +4817,13 @@
     <w:abstractNumId w:val="2"/>
   </w:num>
   <w:num w:numId="37">
-    <w:abstractNumId w:val="14"/>
+    <w:abstractNumId w:val="15"/>
   </w:num>
   <w:num w:numId="38">
     <w:abstractNumId w:val="12"/>
+  </w:num>
+  <w:num w:numId="39">
+    <w:abstractNumId w:val="14"/>
   </w:num>
 </w:numbering>
 </file>

</xml_diff>